<commit_message>
Novo texto da capa
Texto do proprietário, na íntegra. Saem da abertura a duração e a síntese
clínica, que já têm seções próprias, e o nome da cidade — o presencial passa a
"Paraná", com o endereço completo mantido em "Onde atendo".

Co-Authored-By: Claude Opus 5 <noreply@anthropic.com>
Claude-Session: https://claude.ai/code/session_016orvTjMYCY1n7XEhNA3pKM
</commit_message>
<xml_diff>
--- a/faq-site.docx
+++ b/faq-site.docx
@@ -4,322 +4,42 @@
   <w:body>
     <w:p>
       <w:pPr>
-        <w:spacing w:after="360"/>
+        <w:pStyle w:val="NormalWeb"/>
       </w:pPr>
       <w:r>
-        <w:rPr>
-          <w:rFonts w:ascii="Calibri" w:eastAsia="Calibri" w:hAnsi="Calibri" w:cs="Calibri"/>
-          <w:b/>
-          <w:bCs/>
-          <w:color w:val="1F3A5F"/>
-          <w:sz w:val="32"/>
-          <w:szCs w:val="32"/>
-        </w:rPr>
-        <w:t>Perguntas frequentes</w:t>
+        <w:t>MÉDICO | CRM-PR 55063</w:t>
       </w:r>
     </w:p>
     <w:p>
       <w:pPr>
-        <w:keepNext/>
-        <w:spacing w:before="280" w:after="120"/>
+        <w:pStyle w:val="NormalWeb"/>
       </w:pPr>
       <w:r>
-        <w:rPr>
-          <w:rFonts w:ascii="Calibri" w:eastAsia="Calibri" w:hAnsi="Calibri" w:cs="Calibri"/>
-          <w:b/>
-          <w:bCs/>
-          <w:color w:val="2E5C8A"/>
-          <w:sz w:val="24"/>
-          <w:szCs w:val="24"/>
-        </w:rPr>
-        <w:t>Como funciona a primeira consulta?</w:t>
+        <w:t>O tratamento precisa fazer sentido.</w:t>
       </w:r>
     </w:p>
     <w:p>
       <w:pPr>
-        <w:spacing w:after="120" w:line="276" w:lineRule="auto"/>
-        <w:jc w:val="both"/>
+        <w:pStyle w:val="NormalWeb"/>
       </w:pPr>
       <w:r>
-        <w:rPr>
-          <w:rFonts w:ascii="Calibri" w:eastAsia="Calibri" w:hAnsi="Calibri" w:cs="Calibri"/>
-          <w:sz w:val="22"/>
-          <w:szCs w:val="22"/>
-        </w:rPr>
-        <w:t>A primeira consulta é um momento mais amplo, para compreender sua história, organizar as queixas atuais e definir, em conjunto, o plano inicial de cuidado. Tem duração de até 60 minutos e pode ser realizada de forma presencial ou on-line.</w:t>
+        <w:t>Há sofrimentos que quase ninguém vê, mas que acabam ocupando espaço demais na vida.</w:t>
       </w:r>
     </w:p>
     <w:p>
       <w:pPr>
-        <w:keepNext/>
-        <w:spacing w:before="280" w:after="120"/>
+        <w:pStyle w:val="NormalWeb"/>
       </w:pPr>
       <w:r>
-        <w:rPr>
-          <w:rFonts w:ascii="Calibri" w:eastAsia="Calibri" w:hAnsi="Calibri" w:cs="Calibri"/>
-          <w:b/>
-          <w:bCs/>
-          <w:color w:val="2E5C8A"/>
-          <w:sz w:val="24"/>
-          <w:szCs w:val="24"/>
-        </w:rPr>
-        <w:t>Qual é o valor das consultas?</w:t>
+        <w:t>Uma boa consulta precisa ir além do nome do diagnóstico. É preciso entender com calma o que está acontecendo, como isso tem afetado sua vida e o que já foi tentado — para então definir um tratamento que tenha lógica e faça sentido para você.</w:t>
       </w:r>
     </w:p>
     <w:p>
       <w:pPr>
-        <w:keepNext/>
-        <w:spacing w:before="280" w:after="120"/>
-        <w:rPr>
-          <w:rFonts w:ascii="Calibri" w:eastAsia="Calibri" w:hAnsi="Calibri" w:cs="Calibri"/>
-          <w:sz w:val="22"/>
-          <w:szCs w:val="22"/>
-        </w:rPr>
+        <w:pStyle w:val="NormalWeb"/>
       </w:pPr>
       <w:r>
-        <w:rPr>
-          <w:rFonts w:ascii="Calibri" w:eastAsia="Calibri" w:hAnsi="Calibri" w:cs="Calibri"/>
-          <w:sz w:val="22"/>
-          <w:szCs w:val="22"/>
-        </w:rPr>
-        <w:t>R$ 550,00 por consulta com duração de aproximadamente 60 minutos, com a síntese clínica ao final.</w:t>
-      </w:r>
-    </w:p>
-    <w:p>
-      <w:pPr>
-        <w:keepNext/>
-        <w:spacing w:before="280" w:after="120"/>
-        <w:rPr>
-          <w:rFonts w:ascii="Calibri" w:eastAsia="Calibri" w:hAnsi="Calibri" w:cs="Calibri"/>
-          <w:sz w:val="22"/>
-          <w:szCs w:val="22"/>
-        </w:rPr>
-      </w:pPr>
-      <w:r>
-        <w:rPr>
-          <w:rFonts w:ascii="Calibri" w:eastAsia="Calibri" w:hAnsi="Calibri" w:cs="Calibri"/>
-          <w:sz w:val="22"/>
-          <w:szCs w:val="22"/>
-        </w:rPr>
-        <w:t>Formas de pagamento:</w:t>
-      </w:r>
-      <w:r>
-        <w:rPr>
-          <w:rFonts w:ascii="Calibri" w:eastAsia="Calibri" w:hAnsi="Calibri" w:cs="Calibri"/>
-          <w:sz w:val="22"/>
-          <w:szCs w:val="22"/>
-        </w:rPr>
-        <w:br/>
-        <w:t>Teleconsulta: Pix.</w:t>
-      </w:r>
-      <w:r>
-        <w:rPr>
-          <w:rFonts w:ascii="Calibri" w:eastAsia="Calibri" w:hAnsi="Calibri" w:cs="Calibri"/>
-          <w:sz w:val="22"/>
-          <w:szCs w:val="22"/>
-        </w:rPr>
-        <w:br/>
-        <w:t>Atendimento presencial: dinheiro, Pix ou cartão.</w:t>
-      </w:r>
-    </w:p>
-    <w:p>
-      <w:pPr>
-        <w:keepNext/>
-        <w:spacing w:before="280" w:after="120"/>
-      </w:pPr>
-      <w:r>
-        <w:rPr>
-          <w:rFonts w:ascii="Calibri" w:eastAsia="Calibri" w:hAnsi="Calibri" w:cs="Calibri"/>
-          <w:b/>
-          <w:bCs/>
-          <w:color w:val="2E5C8A"/>
-          <w:sz w:val="24"/>
-          <w:szCs w:val="24"/>
-        </w:rPr>
-        <w:t>Vou precisar de um retorno logo após a primeira consulta?</w:t>
-      </w:r>
-    </w:p>
-    <w:p>
-      <w:pPr>
-        <w:spacing w:after="120" w:line="276" w:lineRule="auto"/>
-        <w:jc w:val="both"/>
-      </w:pPr>
-      <w:r>
-        <w:rPr>
-          <w:rFonts w:ascii="Calibri" w:eastAsia="Calibri" w:hAnsi="Calibri" w:cs="Calibri"/>
-          <w:sz w:val="22"/>
-          <w:szCs w:val="22"/>
-        </w:rPr>
-        <w:t>Quando necessário, a primeira consulta inclui um encontro breve entre 15 e 30 dias, com duração de até 30 minutos, para acompanhar o início do tratamento. Esse encontro serve para avaliar a evolução, a adaptação ao tratamento e eventuais ajustes no plano iniciado.</w:t>
-      </w:r>
-    </w:p>
-    <w:p>
-      <w:pPr>
-        <w:keepNext/>
-        <w:spacing w:before="280" w:after="120"/>
-      </w:pPr>
-      <w:r>
-        <w:rPr>
-          <w:rFonts w:ascii="Calibri" w:eastAsia="Calibri" w:hAnsi="Calibri" w:cs="Calibri"/>
-          <w:b/>
-          <w:bCs/>
-          <w:color w:val="2E5C8A"/>
-          <w:sz w:val="24"/>
-          <w:szCs w:val="24"/>
-        </w:rPr>
-        <w:t>Com que frequência serão as consultas?</w:t>
-      </w:r>
-    </w:p>
-    <w:p>
-      <w:pPr>
-        <w:spacing w:after="120" w:line="276" w:lineRule="auto"/>
-        <w:jc w:val="both"/>
-      </w:pPr>
-      <w:r>
-        <w:rPr>
-          <w:rFonts w:ascii="Calibri" w:eastAsia="Calibri" w:hAnsi="Calibri" w:cs="Calibri"/>
-          <w:sz w:val="22"/>
-          <w:szCs w:val="22"/>
-        </w:rPr>
-        <w:t>Depois dessa etapa inicial, o intervalo entre as consultas é definido de forma individual, de acordo com a evolução e a necessidade de cada paciente.</w:t>
-      </w:r>
-    </w:p>
-    <w:p>
-      <w:pPr>
-        <w:keepNext/>
-        <w:spacing w:before="280" w:after="120"/>
-      </w:pPr>
-      <w:r>
-        <w:rPr>
-          <w:rFonts w:ascii="Calibri" w:eastAsia="Calibri" w:hAnsi="Calibri" w:cs="Calibri"/>
-          <w:b/>
-          <w:bCs/>
-          <w:color w:val="2E5C8A"/>
-          <w:sz w:val="24"/>
-          <w:szCs w:val="24"/>
-        </w:rPr>
-        <w:t>Como são as consultas de acompanhamento?</w:t>
-      </w:r>
-    </w:p>
-    <w:p>
-      <w:pPr>
-        <w:spacing w:after="120" w:line="276" w:lineRule="auto"/>
-        <w:jc w:val="both"/>
-      </w:pPr>
-      <w:r>
-        <w:rPr>
-          <w:rFonts w:ascii="Calibri" w:eastAsia="Calibri" w:hAnsi="Calibri" w:cs="Calibri"/>
-          <w:sz w:val="22"/>
-          <w:szCs w:val="22"/>
-        </w:rPr>
-        <w:t>Têm duração de até 60 minutos, conforme a necessidade do acompanhamento, e são destinadas à avaliação da evolução, da resposta ao tratamento e aos ajustes necessários ao longo do cuidado.</w:t>
-      </w:r>
-    </w:p>
-    <w:p>
-      <w:pPr>
-        <w:keepNext/>
-        <w:spacing w:before="280" w:after="120"/>
-      </w:pPr>
-      <w:r>
-        <w:rPr>
-          <w:rFonts w:ascii="Calibri" w:eastAsia="Calibri" w:hAnsi="Calibri" w:cs="Calibri"/>
-          <w:b/>
-          <w:bCs/>
-          <w:color w:val="2E5C8A"/>
-          <w:sz w:val="24"/>
-          <w:szCs w:val="24"/>
-        </w:rPr>
-        <w:t>Preciso marcar consulta para pedir uma nova receita?</w:t>
-      </w:r>
-    </w:p>
-    <w:p>
-      <w:pPr>
-        <w:spacing w:after="120" w:line="276" w:lineRule="auto"/>
-        <w:jc w:val="both"/>
-      </w:pPr>
-      <w:r>
-        <w:rPr>
-          <w:rFonts w:ascii="Calibri" w:eastAsia="Calibri" w:hAnsi="Calibri" w:cs="Calibri"/>
-          <w:sz w:val="22"/>
-          <w:szCs w:val="22"/>
-        </w:rPr>
-        <w:t>Enquanto o paciente estiver em acompanhamento regular, eventuais reemissões de receitas ou de documentos já emitidos podem ser solicitadas pelo canal de contato.</w:t>
-      </w:r>
-    </w:p>
-    <w:p>
-      <w:pPr>
-        <w:spacing w:after="120" w:line="276" w:lineRule="auto"/>
-        <w:jc w:val="both"/>
-      </w:pPr>
-      <w:r>
-        <w:rPr>
-          <w:rFonts w:ascii="Calibri" w:eastAsia="Calibri" w:hAnsi="Calibri" w:cs="Calibri"/>
-          <w:sz w:val="22"/>
-          <w:szCs w:val="22"/>
-        </w:rPr>
-        <w:t>Quando houver necessidade de avaliar novos sintomas, rever o quadro ou modificar o tratamento, a orientação é realizar uma consulta, para que essas decisões sejam tomadas com segurança e com o contexto necessário.</w:t>
-      </w:r>
-    </w:p>
-    <w:p>
-      <w:pPr>
-        <w:keepNext/>
-        <w:spacing w:before="280" w:after="120"/>
-      </w:pPr>
-      <w:r>
-        <w:rPr>
-          <w:rFonts w:ascii="Calibri" w:eastAsia="Calibri" w:hAnsi="Calibri" w:cs="Calibri"/>
-          <w:b/>
-          <w:bCs/>
-          <w:color w:val="2E5C8A"/>
-          <w:sz w:val="24"/>
-          <w:szCs w:val="24"/>
-        </w:rPr>
-        <w:t>Posso entrar em contato entre as consultas?</w:t>
-      </w:r>
-    </w:p>
-    <w:p>
-      <w:pPr>
-        <w:spacing w:after="120" w:line="276" w:lineRule="auto"/>
-        <w:jc w:val="both"/>
-      </w:pPr>
-      <w:r>
-        <w:rPr>
-          <w:rFonts w:ascii="Calibri" w:eastAsia="Calibri" w:hAnsi="Calibri" w:cs="Calibri"/>
-          <w:sz w:val="22"/>
-          <w:szCs w:val="22"/>
-        </w:rPr>
-        <w:t>Sim. O canal de contato pode ser utilizado para reemissão de receitas e documentos já emitidos, agendamentos e outras questões administrativas.</w:t>
-      </w:r>
-    </w:p>
-    <w:p>
-      <w:pPr>
-        <w:keepNext/>
-        <w:spacing w:before="280" w:after="120"/>
-      </w:pPr>
-      <w:r>
-        <w:rPr>
-          <w:rFonts w:ascii="Calibri" w:eastAsia="Calibri" w:hAnsi="Calibri" w:cs="Calibri"/>
-          <w:b/>
-          <w:bCs/>
-          <w:color w:val="2E5C8A"/>
-          <w:sz w:val="24"/>
-          <w:szCs w:val="24"/>
-        </w:rPr>
-        <w:t>E em caso de urgência?</w:t>
-      </w:r>
-    </w:p>
-    <w:p>
-      <w:pPr>
-        <w:spacing w:after="120" w:line="276" w:lineRule="auto"/>
-        <w:jc w:val="both"/>
-      </w:pPr>
-      <w:r>
-        <w:rPr>
-          <w:rFonts w:ascii="Calibri" w:eastAsia="Calibri" w:hAnsi="Calibri" w:cs="Calibri"/>
-          <w:sz w:val="22"/>
-          <w:szCs w:val="22"/>
-        </w:rPr>
-        <w:t>Em situações de urgência, procure atendimento presencial no serviço de emergência mais próximo ou ligue 192.</w:t>
+        <w:t>Teleconsulta para todo o Brasil, presencial no Paraná.</w:t>
       </w:r>
     </w:p>
     <w:p>
@@ -915,6 +635,7 @@
   <w:style w:type="character" w:default="1" w:styleId="Fontepargpadro">
     <w:name w:val="Default Paragraph Font"/>
     <w:uiPriority w:val="1"/>
+    <w:semiHidden/>
     <w:unhideWhenUsed/>
   </w:style>
   <w:style w:type="table" w:default="1" w:styleId="Tabelanormal">
@@ -1020,6 +741,21 @@
     <w:rPr>
       <w:sz w:val="20"/>
       <w:szCs w:val="20"/>
+    </w:rPr>
+  </w:style>
+  <w:style w:type="paragraph" w:styleId="NormalWeb">
+    <w:name w:val="Normal (Web)"/>
+    <w:basedOn w:val="Normal"/>
+    <w:uiPriority w:val="99"/>
+    <w:semiHidden/>
+    <w:unhideWhenUsed/>
+    <w:rsid w:val="00AC4900"/>
+    <w:pPr>
+      <w:spacing w:before="100" w:beforeAutospacing="1" w:after="100" w:afterAutospacing="1"/>
+    </w:pPr>
+    <w:rPr>
+      <w:sz w:val="24"/>
+      <w:szCs w:val="24"/>
     </w:rPr>
   </w:style>
 </w:styles>

</xml_diff>

<commit_message>
Enxuga o texto da capa
Versão do proprietário: 74 para 51 palavras. Sai a duplicação com "História e
contexto" e "fazer sentido" volta a aparecer uma vez só na página.

Co-Authored-By: Claude Opus 5 <noreply@anthropic.com>
Claude-Session: https://claude.ai/code/session_016orvTjMYCY1n7XEhNA3pKM
</commit_message>
<xml_diff>
--- a/faq-site.docx
+++ b/faq-site.docx
@@ -23,7 +23,13 @@
         <w:pStyle w:val="NormalWeb"/>
       </w:pPr>
       <w:r>
-        <w:t>Há sofrimentos que quase ninguém vê, mas que acabam ocupando espaço demais na vida.</w:t>
+        <w:t xml:space="preserve">Há sofrimentos que </w:t>
+      </w:r>
+      <w:r>
+        <w:t xml:space="preserve">ocupam </w:t>
+      </w:r>
+      <w:r>
+        <w:t>espaço demais na vida.</w:t>
       </w:r>
     </w:p>
     <w:p>
@@ -31,7 +37,22 @@
         <w:pStyle w:val="NormalWeb"/>
       </w:pPr>
       <w:r>
-        <w:t>Uma boa consulta precisa ir além do nome do diagnóstico. É preciso entender com calma o que está acontecendo, como isso tem afetado sua vida e o que já foi tentado — para então definir um tratamento que tenha lógica e faça sentido para você.</w:t>
+        <w:t>Uma boa consulta precisa ir além do diagnóstico. É preciso entender o que está acontecendo</w:t>
+      </w:r>
+      <w:r>
+        <w:t xml:space="preserve"> e </w:t>
+      </w:r>
+      <w:r>
+        <w:t>como isso tem afetado sua vida</w:t>
+      </w:r>
+      <w:r>
+        <w:t xml:space="preserve"> </w:t>
+      </w:r>
+      <w:r>
+        <w:t>— para então definir um tratamento</w:t>
+      </w:r>
+      <w:r>
+        <w:t>.</w:t>
       </w:r>
     </w:p>
     <w:p>

</xml_diff>